<commit_message>
Sync resume downloads with updated DOCX
</commit_message>
<xml_diff>
--- a/site-v2/public/downloads/resume.docx
+++ b/site-v2/public/downloads/resume.docx
@@ -4,691 +4,1874 @@
   <w:body>
     <w:p>
       <w:pPr>
-        <w:pStyle w:val="Heading1"/>
+        <w:spacing w:after="120" w:before="0"/>
+        <w:jc w:val="center"/>
       </w:pPr>
       <w:r>
+        <w:rPr>
+          <w:b/>
+          <w:i w:val="0"/>
+          <w:color w:val="1E3A8A"/>
+          <w:sz w:val="40"/>
+        </w:rPr>
         <w:t>MICHAEL R. ROBINSON</w:t>
       </w:r>
     </w:p>
     <w:p>
+      <w:pPr>
+        <w:spacing w:after="60" w:before="0"/>
+        <w:jc w:val="center"/>
+      </w:pPr>
       <w:r>
+        <w:rPr>
+          <w:b w:val="0"/>
+          <w:i w:val="0"/>
+          <w:color w:val="1F2937"/>
+          <w:sz w:val="24"/>
+        </w:rPr>
         <w:t>Azure Architecture and Engineering Manager | DoD Cloud Modernization &amp; Secure Architecture</w:t>
       </w:r>
     </w:p>
     <w:p>
       <w:pPr>
-        <w:pStyle w:val="Heading1"/>
+        <w:spacing w:after="40" w:before="0"/>
+        <w:jc w:val="center"/>
       </w:pPr>
+      <w:r>
+        <w:rPr>
+          <w:b w:val="0"/>
+          <w:i w:val="0"/>
+          <w:color w:val="1F2937"/>
+          <w:sz w:val="19"/>
+        </w:rPr>
+        <w:t>St. Petersburg, FL | Remote / Relocation Eligible</w:t>
+      </w:r>
     </w:p>
     <w:p>
       <w:pPr>
-        <w:pStyle w:val="Heading1"/>
+        <w:spacing w:after="80" w:before="0"/>
+        <w:jc w:val="center"/>
       </w:pPr>
       <w:r>
-        <w:t>CLOUD ARCHITECT SUMMARY</w:t>
+        <w:rPr>
+          <w:b/>
+          <w:i w:val="0"/>
+          <w:color w:val="1F2937"/>
+          <w:sz w:val="19"/>
+        </w:rPr>
+        <w:t>727-313-1018  •  michaelrobinsonjr@gmail.com</w:t>
+      </w:r>
+    </w:p>
+    <w:p>
+      <w:pPr>
+        <w:spacing w:before="280" w:after="80"/>
+      </w:pPr>
+      <w:r>
+        <w:rPr>
+          <w:b/>
+          <w:i w:val="0"/>
+          <w:color w:val="1E3A8A"/>
+          <w:sz w:val="32"/>
+        </w:rPr>
+        <w:t>PROFESSIONAL SUMMARY</w:t>
+      </w:r>
+    </w:p>
+    <w:p>
+      <w:pPr>
+        <w:spacing w:after="80" w:before="0"/>
+      </w:pPr>
+      <w:r>
+        <w:rPr>
+          <w:b w:val="0"/>
+          <w:i w:val="0"/>
+          <w:color w:val="1F2937"/>
+          <w:sz w:val="19"/>
+        </w:rPr>
+        <w:t>Cloud architect with 20+ years across DoD mission environments and deep hands-on experience designing, delivering, and securing Azure Government cloud architectures at IL5/IL6. Proven leader in cloud modernization, DevSecOps enablement, RMF-aligned architecture, and ATO-ready cloud platforms. Trusted technical authority for senior government stakeholders, bridging mission requirements, security governance, and scalable cloud design across hybrid and multi-cloud environments.</w:t>
+      </w:r>
+    </w:p>
+    <w:p>
+      <w:pPr>
+        <w:spacing w:before="280" w:after="80"/>
+      </w:pPr>
+      <w:r>
+        <w:rPr>
+          <w:b/>
+          <w:i w:val="0"/>
+          <w:color w:val="1E3A8A"/>
+          <w:sz w:val="32"/>
+        </w:rPr>
+        <w:t>CORE COMPETENCIES</w:t>
       </w:r>
     </w:p>
     <w:p>
       <w:r>
-        <w:t>Cloud architect with 20+ years across DoD mission environments. I design secure cloud platforms, build DevSecOps pipelines, and lead modernization efforts for mission-critical systems in regulated IL4/IL5/IL6 contexts.</w:t>
+        <w:rPr>
+          <w:b/>
+          <w:i w:val="0"/>
+          <w:color w:val="1E3A8A"/>
+          <w:sz w:val="19"/>
+        </w:rPr>
+        <w:t xml:space="preserve">Cloud Platforms: </w:t>
+      </w:r>
+      <w:r>
+        <w:rPr>
+          <w:b w:val="0"/>
+          <w:i w:val="0"/>
+          <w:sz w:val="19"/>
+        </w:rPr>
+        <w:t>Azure Government (IL5/IL6)</w:t>
+      </w:r>
+    </w:p>
+    <w:p>
+      <w:r>
+        <w:rPr>
+          <w:b/>
+          <w:i w:val="0"/>
+          <w:color w:val="1E3A8A"/>
+          <w:sz w:val="19"/>
+        </w:rPr>
+        <w:t xml:space="preserve">AWS: </w:t>
+      </w:r>
+      <w:r>
+        <w:rPr>
+          <w:b w:val="0"/>
+          <w:i w:val="0"/>
+          <w:sz w:val="19"/>
+        </w:rPr>
+        <w:t>(Gov &amp; Commercial)</w:t>
+      </w:r>
+    </w:p>
+    <w:p>
+      <w:r>
+        <w:rPr>
+          <w:b/>
+          <w:i w:val="0"/>
+          <w:color w:val="1E3A8A"/>
+          <w:sz w:val="19"/>
+        </w:rPr>
+        <w:t xml:space="preserve">OCI &amp; GCP: </w:t>
+      </w:r>
+      <w:r>
+        <w:rPr>
+          <w:b w:val="0"/>
+          <w:i w:val="0"/>
+          <w:sz w:val="19"/>
+        </w:rPr>
+        <w:t>(Cloud One Exposure)</w:t>
       </w:r>
     </w:p>
     <w:p>
       <w:pPr>
-        <w:pStyle w:val="Heading1"/>
+        <w:spacing w:before="120" w:after="0"/>
+        <w:pBdr>
+          <w:bottom w:val="single" w:sz="4" w:space="1" w:color="1E3A8A"/>
+        </w:pBdr>
       </w:pPr>
+    </w:p>
+    <w:p>
       <w:r>
-        <w:t>CORE ARCHITECTURE &amp; CLOUD SKILLS</w:t>
+        <w:rPr>
+          <w:b/>
+          <w:i w:val="0"/>
+          <w:color w:val="1E3A8A"/>
+          <w:sz w:val="19"/>
+        </w:rPr>
+        <w:t xml:space="preserve">Architecture Domains: </w:t>
       </w:r>
-    </w:p>
-    <w:p/>
-    <w:p>
-      <w:pPr>
-        <w:pStyle w:val="Heading3"/>
-      </w:pPr>
       <w:r>
-        <w:t>Cloud Platforms</w:t>
+        <w:rPr>
+          <w:b w:val="0"/>
+          <w:i w:val="0"/>
+          <w:sz w:val="19"/>
+        </w:rPr>
+        <w:t>Enterprise Cloud Architecture • Secure Landing Zones • Network &amp; Identity Architecture</w:t>
       </w:r>
     </w:p>
     <w:p>
       <w:r>
-        <w:t>Azure Government (IL5/IL6) • AWS (Gov &amp; Commercial) • OCI &amp; GCP (Cloud One Exposure)</w:t>
+        <w:rPr>
+          <w:b/>
+          <w:i w:val="0"/>
+          <w:color w:val="1E3A8A"/>
+          <w:sz w:val="19"/>
+        </w:rPr>
+        <w:t xml:space="preserve">Zero Trust: </w:t>
+      </w:r>
+      <w:r>
+        <w:rPr>
+          <w:b w:val="0"/>
+          <w:i w:val="0"/>
+          <w:sz w:val="19"/>
+        </w:rPr>
+        <w:t>Alignment • Hybrid &amp; Multi-Cloud Design • Governance &amp; Policy Architecture</w:t>
       </w:r>
     </w:p>
-    <w:p/>
     <w:p>
       <w:pPr>
-        <w:pStyle w:val="Heading3"/>
+        <w:spacing w:before="120" w:after="0"/>
+        <w:pBdr>
+          <w:bottom w:val="single" w:sz="4" w:space="1" w:color="1E3A8A"/>
+        </w:pBdr>
       </w:pPr>
+    </w:p>
+    <w:p>
       <w:r>
-        <w:t>Architecture Domains</w:t>
+        <w:rPr>
+          <w:b/>
+          <w:i w:val="0"/>
+          <w:color w:val="1E3A8A"/>
+          <w:sz w:val="19"/>
+        </w:rPr>
+        <w:t xml:space="preserve">DevSecOps &amp; Automation: </w:t>
+      </w:r>
+      <w:r>
+        <w:rPr>
+          <w:b w:val="0"/>
+          <w:i w:val="0"/>
+          <w:sz w:val="19"/>
+        </w:rPr>
+        <w:t>Terraform • ARM Templates • GitHub • Azure DevOps • Jenkins</w:t>
       </w:r>
     </w:p>
     <w:p>
       <w:r>
-        <w:t>Enterprise Cloud Architecture • Secure Landing Zones • Network &amp; Identity Architecture • Zero Trust Alignment • Hybrid &amp; Multi-Cloud Design • Governance &amp; Policy Architecture</w:t>
+        <w:rPr>
+          <w:b/>
+          <w:i w:val="0"/>
+          <w:color w:val="1E3A8A"/>
+          <w:sz w:val="19"/>
+        </w:rPr>
+        <w:t xml:space="preserve">CI/CD Security: </w:t>
+      </w:r>
+      <w:r>
+        <w:rPr>
+          <w:b w:val="0"/>
+          <w:i w:val="0"/>
+          <w:sz w:val="19"/>
+        </w:rPr>
+        <w:t>Integration • Infrastructure as Code (IaC) Governance • Secure Pipeline Design</w:t>
       </w:r>
     </w:p>
-    <w:p/>
     <w:p>
       <w:pPr>
-        <w:pStyle w:val="Heading3"/>
+        <w:spacing w:before="120" w:after="0"/>
+        <w:pBdr>
+          <w:bottom w:val="single" w:sz="4" w:space="1" w:color="1E3A8A"/>
+        </w:pBdr>
+      </w:pPr>
+    </w:p>
+    <w:p>
+      <w:r>
+        <w:rPr>
+          <w:b/>
+          <w:i w:val="0"/>
+          <w:color w:val="1E3A8A"/>
+          <w:sz w:val="19"/>
+        </w:rPr>
+        <w:t xml:space="preserve">Security &amp; Compliance: </w:t>
+      </w:r>
+      <w:r>
+        <w:rPr>
+          <w:b w:val="0"/>
+          <w:i w:val="0"/>
+          <w:sz w:val="19"/>
+        </w:rPr>
+        <w:t>RMF • ATO Support &amp; Sustainment • DoD SRG • SCCA • NIST 800-53</w:t>
+      </w:r>
+    </w:p>
+    <w:p>
+      <w:r>
+        <w:rPr>
+          <w:b/>
+          <w:i w:val="0"/>
+          <w:color w:val="1E3A8A"/>
+          <w:sz w:val="19"/>
+        </w:rPr>
+        <w:t xml:space="preserve">STIGs &amp; POA&amp;M: </w:t>
+      </w:r>
+      <w:r>
+        <w:rPr>
+          <w:b w:val="0"/>
+          <w:i w:val="0"/>
+          <w:sz w:val="19"/>
+        </w:rPr>
+        <w:t>DISA STIGs • POA&amp;M Management • Continuous Compliance Engineering</w:t>
+      </w:r>
+    </w:p>
+    <w:p>
+      <w:pPr>
+        <w:spacing w:before="120" w:after="0"/>
+        <w:pBdr>
+          <w:bottom w:val="single" w:sz="4" w:space="1" w:color="1E3A8A"/>
+        </w:pBdr>
+      </w:pPr>
+    </w:p>
+    <w:p>
+      <w:r>
+        <w:rPr>
+          <w:b/>
+          <w:i w:val="0"/>
+          <w:color w:val="1E3A8A"/>
+          <w:sz w:val="19"/>
+        </w:rPr>
+        <w:t xml:space="preserve">Leadership &amp; Delivery: </w:t>
+      </w:r>
+      <w:r>
+        <w:rPr>
+          <w:b w:val="0"/>
+          <w:i w:val="0"/>
+          <w:sz w:val="19"/>
+        </w:rPr>
+        <w:t>Technical Authority • Architecture Reviews • Trade Studies • White Papers</w:t>
+      </w:r>
+    </w:p>
+    <w:p>
+      <w:r>
+        <w:rPr>
+          <w:b/>
+          <w:i w:val="0"/>
+          <w:color w:val="1E3A8A"/>
+          <w:sz w:val="19"/>
+        </w:rPr>
+        <w:t xml:space="preserve">Agile &amp; Communication: </w:t>
+      </w:r>
+      <w:r>
+        <w:rPr>
+          <w:b w:val="0"/>
+          <w:i w:val="0"/>
+          <w:sz w:val="19"/>
+        </w:rPr>
+        <w:t>Senior Leadership Briefings • Agile / Kanban • Cross-Functional Engineering Leadership</w:t>
+      </w:r>
+    </w:p>
+    <w:p>
+      <w:pPr>
+        <w:spacing w:before="280" w:after="80"/>
       </w:pPr>
       <w:r>
+        <w:rPr>
+          <w:b/>
+          <w:i w:val="0"/>
+          <w:color w:val="1E3A8A"/>
+          <w:sz w:val="32"/>
+        </w:rPr>
+        <w:t>PROFESSIONAL EXPERIENCE</w:t>
+      </w:r>
+    </w:p>
+    <w:p>
+      <w:r>
+        <w:rPr>
+          <w:b/>
+          <w:i w:val="0"/>
+          <w:color w:val="1E3A8A"/>
+          <w:sz w:val="24"/>
+        </w:rPr>
+        <w:t>Azure Architecture and Engineering Manager</w:t>
+      </w:r>
+      <w:r>
+        <w:rPr>
+          <w:b w:val="0"/>
+          <w:i w:val="0"/>
+          <w:sz w:val="20"/>
+        </w:rPr>
+        <w:tab/>
+        <w:t>Leidos – USAF Cloud One ACSS Program | Remote</w:t>
+      </w:r>
+    </w:p>
+    <w:p>
+      <w:pPr>
+        <w:spacing w:after="80" w:before="0"/>
+        <w:jc w:val="right"/>
+      </w:pPr>
+      <w:r>
+        <w:rPr>
+          <w:b w:val="0"/>
+          <w:i w:val="0"/>
+          <w:color w:val="1F2937"/>
+          <w:sz w:val="19"/>
+        </w:rPr>
+        <w:t>2026 – Present</w:t>
+      </w:r>
+    </w:p>
+    <w:p>
+      <w:r>
+        <w:rPr>
+          <w:b w:val="0"/>
+          <w:i w:val="0"/>
+          <w:sz w:val="19"/>
+        </w:rPr>
+        <w:t>Lead Azure architecture and engineering for the U.S. Air Force Cloud One Architecture and Common Shared Services (ACSS) multi-cloud environment spanning Azure, AWS, Google, and Oracle.</w:t>
+      </w:r>
+    </w:p>
+    <w:p>
+      <w:pPr>
+        <w:spacing w:before="160" w:after="40"/>
+      </w:pPr>
+      <w:r>
+        <w:rPr>
+          <w:b/>
+          <w:i w:val="0"/>
+          <w:color w:val="1E3A8A"/>
+          <w:sz w:val="20"/>
+        </w:rPr>
+        <w:t>Architectural &amp; Strategic Responsibilities</w:t>
+      </w:r>
+    </w:p>
+    <w:p>
+      <w:pPr>
+        <w:spacing w:after="60"/>
+      </w:pPr>
+      <w:r>
+        <w:rPr>
+          <w:b w:val="0"/>
+          <w:i w:val="0"/>
+          <w:color w:val="1F2937"/>
+          <w:sz w:val="19"/>
+        </w:rPr>
+        <w:t>● Define scalable, resilient, and secure Azure reference architectures for the Cloud One multi-cloud environment</w:t>
+      </w:r>
+    </w:p>
+    <w:p>
+      <w:pPr>
+        <w:spacing w:after="60"/>
+      </w:pPr>
+      <w:r>
+        <w:rPr>
+          <w:b w:val="0"/>
+          <w:i w:val="0"/>
+          <w:color w:val="1F2937"/>
+          <w:sz w:val="19"/>
+        </w:rPr>
+        <w:t>● Establish defense-in-depth security models implementing zero-trust principles across IL4/IL5/IL6 boundaries</w:t>
+      </w:r>
+    </w:p>
+    <w:p>
+      <w:pPr>
+        <w:spacing w:after="60"/>
+      </w:pPr>
+      <w:r>
+        <w:rPr>
+          <w:b w:val="0"/>
+          <w:i w:val="0"/>
+          <w:color w:val="1F2937"/>
+          <w:sz w:val="19"/>
+        </w:rPr>
+        <w:t>● Drive adoption of DevSecOps practices, infrastructure as code, and automation using Terraform, Ansible, Jenkins, and Kubernetes</w:t>
+      </w:r>
+    </w:p>
+    <w:p>
+      <w:pPr>
+        <w:spacing w:before="160" w:after="40"/>
+      </w:pPr>
+      <w:r>
+        <w:rPr>
+          <w:b/>
+          <w:i w:val="0"/>
+          <w:color w:val="1E3A8A"/>
+          <w:sz w:val="20"/>
+        </w:rPr>
+        <w:t>Team &amp; Engineering Leadership</w:t>
+      </w:r>
+    </w:p>
+    <w:p>
+      <w:pPr>
+        <w:spacing w:after="60"/>
+      </w:pPr>
+      <w:r>
+        <w:rPr>
+          <w:b w:val="0"/>
+          <w:i w:val="0"/>
+          <w:color w:val="1F2937"/>
+          <w:sz w:val="19"/>
+        </w:rPr>
+        <w:t>● Manage and mentor a team of cloud engineers delivering secure, cloud-native shared services across IL4/IL5/IL6 workloads</w:t>
+      </w:r>
+    </w:p>
+    <w:p>
+      <w:pPr>
+        <w:spacing w:after="60"/>
+      </w:pPr>
+      <w:r>
+        <w:rPr>
+          <w:b w:val="0"/>
+          <w:i w:val="0"/>
+          <w:color w:val="1F2937"/>
+          <w:sz w:val="19"/>
+        </w:rPr>
+        <w:t>● Establish engineering standards and best practices for cloud architecture and DevSecOps implementation</w:t>
+      </w:r>
+    </w:p>
+    <w:p>
+      <w:pPr>
+        <w:spacing w:before="160" w:after="40"/>
+      </w:pPr>
+      <w:r>
+        <w:rPr>
+          <w:b/>
+          <w:i w:val="0"/>
+          <w:color w:val="1E3A8A"/>
+          <w:sz w:val="20"/>
+        </w:rPr>
+        <w:t>Key Contributions</w:t>
+      </w:r>
+    </w:p>
+    <w:p>
+      <w:pPr>
+        <w:spacing w:after="60"/>
+      </w:pPr>
+      <w:r>
+        <w:rPr>
+          <w:b w:val="0"/>
+          <w:i w:val="0"/>
+          <w:color w:val="1F2937"/>
+          <w:sz w:val="19"/>
+        </w:rPr>
+        <w:t>● Advancing standardized, secure Azure reference architectures and DevSecOps automation across the Cloud One environment</w:t>
+      </w:r>
+    </w:p>
+    <w:p>
+      <w:pPr>
+        <w:spacing w:after="60"/>
+      </w:pPr>
+      <w:r>
+        <w:rPr>
+          <w:b w:val="0"/>
+          <w:i w:val="0"/>
+          <w:color w:val="1F2937"/>
+          <w:sz w:val="19"/>
+        </w:rPr>
+        <w:t>● Strengthening USAF system resiliency, security, and cost effectiveness through architecture leadership</w:t>
+      </w:r>
+    </w:p>
+    <w:p>
+      <w:pPr>
+        <w:spacing w:before="120" w:after="0"/>
+        <w:pBdr>
+          <w:bottom w:val="single" w:sz="4" w:space="1" w:color="1E3A8A"/>
+        </w:pBdr>
+      </w:pPr>
+    </w:p>
+    <w:p>
+      <w:r>
+        <w:rPr>
+          <w:b/>
+          <w:i w:val="0"/>
+          <w:color w:val="1E3A8A"/>
+          <w:sz w:val="24"/>
+        </w:rPr>
+        <w:t>Senior Cloud Cyber Security Engineer – Lead</w:t>
+      </w:r>
+      <w:r>
+        <w:rPr>
+          <w:b w:val="0"/>
+          <w:i w:val="0"/>
+          <w:sz w:val="20"/>
+        </w:rPr>
+        <w:tab/>
+        <w:t>SAIC – Cloud One Program | Remote</w:t>
+      </w:r>
+    </w:p>
+    <w:p>
+      <w:pPr>
+        <w:spacing w:after="80" w:before="0"/>
+        <w:jc w:val="right"/>
+      </w:pPr>
+      <w:r>
+        <w:rPr>
+          <w:b w:val="0"/>
+          <w:i w:val="0"/>
+          <w:color w:val="1F2937"/>
+          <w:sz w:val="19"/>
+        </w:rPr>
+        <w:t>2023 – 2026</w:t>
+      </w:r>
+    </w:p>
+    <w:p>
+      <w:r>
+        <w:rPr>
+          <w:b w:val="0"/>
+          <w:i w:val="0"/>
+          <w:sz w:val="19"/>
+        </w:rPr>
+        <w:t>Serve as senior cybersecurity engineer supporting the Cloud One Common Computing Environment—a globally distributed hybrid cloud hosting mission-critical USAF and Army workloads.</w:t>
+      </w:r>
+    </w:p>
+    <w:p>
+      <w:pPr>
+        <w:spacing w:before="160" w:after="40"/>
+      </w:pPr>
+      <w:r>
+        <w:rPr>
+          <w:b/>
+          <w:i w:val="0"/>
+          <w:color w:val="1E3A8A"/>
+          <w:sz w:val="20"/>
+        </w:rPr>
+        <w:t>Architectural &amp; Strategic Responsibilities</w:t>
+      </w:r>
+    </w:p>
+    <w:p>
+      <w:pPr>
+        <w:spacing w:after="60"/>
+      </w:pPr>
+      <w:r>
+        <w:rPr>
+          <w:b w:val="0"/>
+          <w:i w:val="0"/>
+          <w:color w:val="1F2937"/>
+          <w:sz w:val="19"/>
+        </w:rPr>
+        <w:t>● Define inheritable security control frameworks aligned to NIST 800-53, SRGs, STIGs, and DoD 8500/8510 guidance</w:t>
+      </w:r>
+    </w:p>
+    <w:p>
+      <w:pPr>
+        <w:spacing w:after="60"/>
+      </w:pPr>
+      <w:r>
+        <w:rPr>
+          <w:b w:val="0"/>
+          <w:i w:val="0"/>
+          <w:color w:val="1F2937"/>
+          <w:sz w:val="19"/>
+        </w:rPr>
+        <w:t>● Lead vulnerability triage and remediation planning across virtualized, containerized, and cloud-native systems</w:t>
+      </w:r>
+    </w:p>
+    <w:p>
+      <w:pPr>
+        <w:spacing w:before="160" w:after="40"/>
+      </w:pPr>
+      <w:r>
+        <w:rPr>
+          <w:b/>
+          <w:i w:val="0"/>
+          <w:color w:val="1E3A8A"/>
+          <w:sz w:val="20"/>
+        </w:rPr>
+        <w:t>Security Operations &amp; Compliance</w:t>
+      </w:r>
+    </w:p>
+    <w:p>
+      <w:pPr>
+        <w:spacing w:after="60"/>
+      </w:pPr>
+      <w:r>
+        <w:rPr>
+          <w:b w:val="0"/>
+          <w:i w:val="0"/>
+          <w:color w:val="1F2937"/>
+          <w:sz w:val="19"/>
+        </w:rPr>
+        <w:t>● Produce SAP, SAR, and POA&amp;M artifacts supporting RMF and authorization workflows</w:t>
+      </w:r>
+    </w:p>
+    <w:p>
+      <w:pPr>
+        <w:spacing w:after="60"/>
+      </w:pPr>
+      <w:r>
+        <w:rPr>
+          <w:b w:val="0"/>
+          <w:i w:val="0"/>
+          <w:color w:val="1F2937"/>
+          <w:sz w:val="19"/>
+        </w:rPr>
+        <w:t>● Implement and validate controls aligned to NIST 800-53, SRGs, STIGs, and DoD 8500/8510 guidance</w:t>
+      </w:r>
+    </w:p>
+    <w:p>
+      <w:pPr>
+        <w:spacing w:before="160" w:after="40"/>
+      </w:pPr>
+      <w:r>
+        <w:rPr>
+          <w:b/>
+          <w:i w:val="0"/>
+          <w:color w:val="1E3A8A"/>
+          <w:sz w:val="20"/>
+        </w:rPr>
         <w:t>DevSecOps &amp; Automation</w:t>
       </w:r>
     </w:p>
     <w:p>
+      <w:pPr>
+        <w:spacing w:after="60"/>
+      </w:pPr>
       <w:r>
-        <w:t>Terraform • ARM Templates • GitHub • Azure DevOps • Jenkins • CI/CD Security Integration • Infrastructure as Code (IaC) Governance • Secure Pipeline Design</w:t>
+        <w:rPr>
+          <w:b w:val="0"/>
+          <w:i w:val="0"/>
+          <w:color w:val="1F2937"/>
+          <w:sz w:val="19"/>
+        </w:rPr>
+        <w:t>● Integrate security checks into CI/CD pipelines and advise system owners through RMF lifecycle sustainment</w:t>
       </w:r>
     </w:p>
-    <w:p/>
     <w:p>
       <w:pPr>
-        <w:pStyle w:val="Heading3"/>
+        <w:spacing w:after="60"/>
       </w:pPr>
       <w:r>
-        <w:t>Security &amp; Compliance</w:t>
+        <w:rPr>
+          <w:b w:val="0"/>
+          <w:i w:val="0"/>
+          <w:color w:val="1F2937"/>
+          <w:sz w:val="19"/>
+        </w:rPr>
+        <w:t>● Establish repeatable security inheritance patterns to improve compliance velocity across IL4/IL5/IL6 systems</w:t>
+      </w:r>
+    </w:p>
+    <w:p>
+      <w:pPr>
+        <w:spacing w:before="160" w:after="40"/>
+      </w:pPr>
+      <w:r>
+        <w:rPr>
+          <w:b/>
+          <w:i w:val="0"/>
+          <w:color w:val="1E3A8A"/>
+          <w:sz w:val="20"/>
+        </w:rPr>
+        <w:t>Key Contributions</w:t>
+      </w:r>
+    </w:p>
+    <w:p>
+      <w:pPr>
+        <w:spacing w:after="60"/>
+      </w:pPr>
+      <w:r>
+        <w:rPr>
+          <w:b w:val="0"/>
+          <w:i w:val="0"/>
+          <w:color w:val="1F2937"/>
+          <w:sz w:val="19"/>
+        </w:rPr>
+        <w:t>● Improved operational security posture and compliance throughput while sustaining defense-in-depth across hybrid cloud environments</w:t>
+      </w:r>
+    </w:p>
+    <w:p>
+      <w:pPr>
+        <w:spacing w:before="120" w:after="0"/>
+        <w:pBdr>
+          <w:bottom w:val="single" w:sz="4" w:space="1" w:color="1E3A8A"/>
+        </w:pBdr>
+      </w:pPr>
+    </w:p>
+    <w:p>
+      <w:r>
+        <w:rPr>
+          <w:b/>
+          <w:i w:val="0"/>
+          <w:color w:val="1E3A8A"/>
+          <w:sz w:val="24"/>
+        </w:rPr>
+        <w:t>Cloud Architect</w:t>
+      </w:r>
+      <w:r>
+        <w:rPr>
+          <w:b w:val="0"/>
+          <w:i w:val="0"/>
+          <w:sz w:val="20"/>
+        </w:rPr>
+        <w:tab/>
+        <w:t>SAIC – USCENTCOM J6 | MacDill AFB, Tampa, FL</w:t>
+      </w:r>
+    </w:p>
+    <w:p>
+      <w:pPr>
+        <w:spacing w:after="80" w:before="0"/>
+        <w:jc w:val="right"/>
+      </w:pPr>
+      <w:r>
+        <w:rPr>
+          <w:b w:val="0"/>
+          <w:i w:val="0"/>
+          <w:color w:val="1F2937"/>
+          <w:sz w:val="19"/>
+        </w:rPr>
+        <w:t>2022 – 2023</w:t>
       </w:r>
     </w:p>
     <w:p>
       <w:r>
-        <w:t>RMF • ATO Support &amp; Sustainment • DoD SRG • SCCA • NIST 800-53 • DISA STIGs • POA&amp;M Management • Continuous Compliance Engineering</w:t>
+        <w:rPr>
+          <w:b w:val="0"/>
+          <w:i w:val="0"/>
+          <w:sz w:val="19"/>
+        </w:rPr>
+        <w:t>Led architecture for CENTCOM cloud modernization and initial Azure Government IL5/IL6 adoption, balancing mission delivery with strict security and compliance requirements.</w:t>
       </w:r>
     </w:p>
-    <w:p/>
     <w:p>
       <w:pPr>
-        <w:pStyle w:val="Heading3"/>
+        <w:spacing w:before="160" w:after="40"/>
       </w:pPr>
       <w:r>
-        <w:t>Leadership &amp; Delivery</w:t>
+        <w:rPr>
+          <w:b/>
+          <w:i w:val="0"/>
+          <w:color w:val="1E3A8A"/>
+          <w:sz w:val="20"/>
+        </w:rPr>
+        <w:t>Architecture &amp; Platform Leadership</w:t>
+      </w:r>
+    </w:p>
+    <w:p>
+      <w:pPr>
+        <w:spacing w:after="60"/>
+      </w:pPr>
+      <w:r>
+        <w:rPr>
+          <w:b w:val="0"/>
+          <w:i w:val="0"/>
+          <w:color w:val="1F2937"/>
+          <w:sz w:val="19"/>
+        </w:rPr>
+        <w:t>● Designed secure enterprise cloud landing zones aligned to SRG, RMF, and SCCA requirements</w:t>
+      </w:r>
+    </w:p>
+    <w:p>
+      <w:pPr>
+        <w:spacing w:after="60"/>
+      </w:pPr>
+      <w:r>
+        <w:rPr>
+          <w:b w:val="0"/>
+          <w:i w:val="0"/>
+          <w:color w:val="1F2937"/>
+          <w:sz w:val="19"/>
+        </w:rPr>
+        <w:t>● Architected DevSecOps workflows and standardized infrastructure templates for IL5/IL6 provisioning</w:t>
+      </w:r>
+    </w:p>
+    <w:p>
+      <w:pPr>
+        <w:spacing w:before="160" w:after="40"/>
+      </w:pPr>
+      <w:r>
+        <w:rPr>
+          <w:b/>
+          <w:i w:val="0"/>
+          <w:color w:val="1E3A8A"/>
+          <w:sz w:val="20"/>
+        </w:rPr>
+        <w:t>Cloud Modernization &amp; Analytics</w:t>
+      </w:r>
+    </w:p>
+    <w:p>
+      <w:pPr>
+        <w:spacing w:after="60"/>
+      </w:pPr>
+      <w:r>
+        <w:rPr>
+          <w:b w:val="0"/>
+          <w:i w:val="0"/>
+          <w:color w:val="1F2937"/>
+          <w:sz w:val="19"/>
+        </w:rPr>
+        <w:t>● Designed lakehouse analytics patterns with Azure Synapse and medallion architecture</w:t>
+      </w:r>
+    </w:p>
+    <w:p>
+      <w:pPr>
+        <w:spacing w:after="60"/>
+      </w:pPr>
+      <w:r>
+        <w:rPr>
+          <w:b w:val="0"/>
+          <w:i w:val="0"/>
+          <w:color w:val="1F2937"/>
+          <w:sz w:val="19"/>
+        </w:rPr>
+        <w:t>● Produced technical trade studies and migration recommendations for mission owners</w:t>
+      </w:r>
+    </w:p>
+    <w:p>
+      <w:pPr>
+        <w:spacing w:before="160" w:after="40"/>
+      </w:pPr>
+      <w:r>
+        <w:rPr>
+          <w:b/>
+          <w:i w:val="0"/>
+          <w:color w:val="1E3A8A"/>
+          <w:sz w:val="20"/>
+        </w:rPr>
+        <w:t>Key Contributions</w:t>
+      </w:r>
+    </w:p>
+    <w:p>
+      <w:pPr>
+        <w:spacing w:after="60"/>
+      </w:pPr>
+      <w:r>
+        <w:rPr>
+          <w:b w:val="0"/>
+          <w:i w:val="0"/>
+          <w:color w:val="1F2937"/>
+          <w:sz w:val="19"/>
+        </w:rPr>
+        <w:t>● Enabled CENTCOM's first scalable cloud architecture baseline with consistent governance, faster delivery, and improved mission analytics enablement</w:t>
+      </w:r>
+    </w:p>
+    <w:p>
+      <w:pPr>
+        <w:spacing w:after="60"/>
+      </w:pPr>
+      <w:r>
+        <w:rPr>
+          <w:b w:val="0"/>
+          <w:i w:val="0"/>
+          <w:color w:val="1F2937"/>
+          <w:sz w:val="19"/>
+        </w:rPr>
+        <w:t>● Embedded automated compliance validation within CI/CD workflows for continuous security posture monitoring</w:t>
+      </w:r>
+    </w:p>
+    <w:p>
+      <w:pPr>
+        <w:spacing w:before="120" w:after="0"/>
+        <w:pBdr>
+          <w:bottom w:val="single" w:sz="4" w:space="1" w:color="1E3A8A"/>
+        </w:pBdr>
+      </w:pPr>
+    </w:p>
+    <w:p>
+      <w:r>
+        <w:rPr>
+          <w:b/>
+          <w:i w:val="0"/>
+          <w:color w:val="1E3A8A"/>
+          <w:sz w:val="24"/>
+        </w:rPr>
+        <w:t>Innovations Engineer – Cloud &amp; Modernization</w:t>
+      </w:r>
+      <w:r>
+        <w:rPr>
+          <w:b w:val="0"/>
+          <w:i w:val="0"/>
+          <w:sz w:val="20"/>
+        </w:rPr>
+        <w:tab/>
+        <w:t>SAIC – USCENTCOM J6 Technology Innovation Branch | MacDill AFB, Tampa, FL</w:t>
+      </w:r>
+    </w:p>
+    <w:p>
+      <w:pPr>
+        <w:spacing w:after="80" w:before="0"/>
+        <w:jc w:val="right"/>
+      </w:pPr>
+      <w:r>
+        <w:rPr>
+          <w:b w:val="0"/>
+          <w:i w:val="0"/>
+          <w:color w:val="1F2937"/>
+          <w:sz w:val="19"/>
+        </w:rPr>
+        <w:t>2020 – 2022</w:t>
       </w:r>
     </w:p>
     <w:p>
       <w:r>
-        <w:t>Technical Authority • Architecture Reviews • Trade Studies • White Papers • Senior Leadership Briefings • Agile / Kanban • Cross-Functional Engineering Leadership</w:t>
+        <w:rPr>
+          <w:b w:val="0"/>
+          <w:i w:val="0"/>
+          <w:sz w:val="19"/>
+        </w:rPr>
+        <w:t>Advised CENTCOM J6 modernization initiatives by evaluating emerging technologies and mapping them to secure, interoperable adoption paths.</w:t>
       </w:r>
     </w:p>
-    <w:p/>
-    <w:p/>
     <w:p>
       <w:pPr>
-        <w:pStyle w:val="Heading1"/>
+        <w:spacing w:before="160" w:after="40"/>
       </w:pPr>
       <w:r>
-        <w:t>PROFESSIONAL EXPERIENCE</w:t>
+        <w:rPr>
+          <w:b/>
+          <w:i w:val="0"/>
+          <w:color w:val="1E3A8A"/>
+          <w:sz w:val="20"/>
+        </w:rPr>
+        <w:t>Strategic Modernization Advisory</w:t>
       </w:r>
     </w:p>
-    <w:p/>
     <w:p>
       <w:pPr>
-        <w:pStyle w:val="Heading2"/>
+        <w:spacing w:after="60"/>
       </w:pPr>
       <w:r>
-        <w:t>Azure Architecture and Engineering Manager</w:t>
-        <w:br/>
-        <w:t>Leidos - USAF Cloud One ACSS Program | Remote</w:t>
+        <w:rPr>
+          <w:b w:val="0"/>
+          <w:i w:val="0"/>
+          <w:color w:val="1F2937"/>
+          <w:sz w:val="19"/>
+        </w:rPr>
+        <w:t>● Conducted technical evaluations of cyber, cloud, and network capabilities for mission applicability</w:t>
+      </w:r>
+    </w:p>
+    <w:p>
+      <w:pPr>
+        <w:spacing w:after="60"/>
+      </w:pPr>
+      <w:r>
+        <w:rPr>
+          <w:b w:val="0"/>
+          <w:i w:val="0"/>
+          <w:color w:val="1F2937"/>
+          <w:sz w:val="19"/>
+        </w:rPr>
+        <w:t>● Authored briefs and analysis for senior leadership and mission planners</w:t>
+      </w:r>
+    </w:p>
+    <w:p>
+      <w:pPr>
+        <w:spacing w:before="160" w:after="40"/>
+      </w:pPr>
+      <w:r>
+        <w:rPr>
+          <w:b/>
+          <w:i w:val="0"/>
+          <w:color w:val="1E3A8A"/>
+          <w:sz w:val="20"/>
+        </w:rPr>
+        <w:t>Cloud &amp; Security Alignment</w:t>
+      </w:r>
+    </w:p>
+    <w:p>
+      <w:pPr>
+        <w:spacing w:after="60"/>
+      </w:pPr>
+      <w:r>
+        <w:rPr>
+          <w:b w:val="0"/>
+          <w:i w:val="0"/>
+          <w:color w:val="1F2937"/>
+          <w:sz w:val="19"/>
+        </w:rPr>
+        <w:t>● Supported IL5/IL6 migration efforts and ATO-related engineering activities</w:t>
+      </w:r>
+    </w:p>
+    <w:p>
+      <w:pPr>
+        <w:spacing w:after="60"/>
+      </w:pPr>
+      <w:r>
+        <w:rPr>
+          <w:b w:val="0"/>
+          <w:i w:val="0"/>
+          <w:color w:val="1F2937"/>
+          <w:sz w:val="19"/>
+        </w:rPr>
+        <w:t>● Coordinated architecture alignment across matrixed engineering teams</w:t>
+      </w:r>
+    </w:p>
+    <w:p>
+      <w:pPr>
+        <w:spacing w:before="160" w:after="40"/>
+      </w:pPr>
+      <w:r>
+        <w:rPr>
+          <w:b/>
+          <w:i w:val="0"/>
+          <w:color w:val="1E3A8A"/>
+          <w:sz w:val="20"/>
+        </w:rPr>
+        <w:t>Key Contributions</w:t>
+      </w:r>
+    </w:p>
+    <w:p>
+      <w:pPr>
+        <w:spacing w:after="60"/>
+      </w:pPr>
+      <w:r>
+        <w:rPr>
+          <w:b w:val="0"/>
+          <w:i w:val="0"/>
+          <w:color w:val="1F2937"/>
+          <w:sz w:val="19"/>
+        </w:rPr>
+        <w:t>● Helped define a practical modernization roadmap that advanced cloud adoption while meeting security, interoperability, and mission constraints</w:t>
+      </w:r>
+    </w:p>
+    <w:p>
+      <w:pPr>
+        <w:spacing w:before="120" w:after="0"/>
+        <w:pBdr>
+          <w:bottom w:val="single" w:sz="4" w:space="1" w:color="1E3A8A"/>
+        </w:pBdr>
+      </w:pPr>
+    </w:p>
+    <w:p>
+      <w:r>
+        <w:rPr>
+          <w:b/>
+          <w:i w:val="0"/>
+          <w:color w:val="1E3A8A"/>
+          <w:sz w:val="24"/>
+        </w:rPr>
+        <w:t>Senior Cyber Infrastructure Analyst</w:t>
+      </w:r>
+      <w:r>
+        <w:rPr>
+          <w:b w:val="0"/>
+          <w:i w:val="0"/>
+          <w:sz w:val="20"/>
+        </w:rPr>
+        <w:tab/>
+        <w:t>SAIC – USCENTCOM | MacDill AFB, Tampa, FL</w:t>
+      </w:r>
+    </w:p>
+    <w:p>
+      <w:pPr>
+        <w:spacing w:after="80" w:before="0"/>
+        <w:jc w:val="right"/>
+      </w:pPr>
+      <w:r>
+        <w:rPr>
+          <w:b w:val="0"/>
+          <w:i w:val="0"/>
+          <w:color w:val="1F2937"/>
+          <w:sz w:val="19"/>
+        </w:rPr>
+        <w:t>2017 – 2020</w:t>
       </w:r>
     </w:p>
     <w:p>
       <w:r>
-        <w:t>2026-03 to Present</w:t>
+        <w:rPr>
+          <w:b w:val="0"/>
+          <w:i w:val="0"/>
+          <w:sz w:val="19"/>
+        </w:rPr>
+        <w:t>Designed and sustained cybersecurity boundary infrastructure for USCENTCOM headquarters and operational theater networks.</w:t>
+      </w:r>
+    </w:p>
+    <w:p>
+      <w:pPr>
+        <w:spacing w:before="160" w:after="40"/>
+      </w:pPr>
+      <w:r>
+        <w:rPr>
+          <w:b/>
+          <w:i w:val="0"/>
+          <w:color w:val="1E3A8A"/>
+          <w:sz w:val="20"/>
+        </w:rPr>
+        <w:t>Architecture &amp; Cyber Defense Leadership</w:t>
+      </w:r>
+    </w:p>
+    <w:p>
+      <w:pPr>
+        <w:spacing w:after="60"/>
+      </w:pPr>
+      <w:r>
+        <w:rPr>
+          <w:b w:val="0"/>
+          <w:i w:val="0"/>
+          <w:color w:val="1F2937"/>
+          <w:sz w:val="19"/>
+        </w:rPr>
+        <w:t>● Engineered and maintained firewalls, IDS/IPS, and filtering infrastructure across HQ and deployed environments</w:t>
+      </w:r>
+    </w:p>
+    <w:p>
+      <w:pPr>
+        <w:spacing w:after="60"/>
+      </w:pPr>
+      <w:r>
+        <w:rPr>
+          <w:b w:val="0"/>
+          <w:i w:val="0"/>
+          <w:color w:val="1F2937"/>
+          <w:sz w:val="19"/>
+        </w:rPr>
+        <w:t>● Led planning for CND tool migration to JRSS and modernization tracks</w:t>
+      </w:r>
+    </w:p>
+    <w:p>
+      <w:pPr>
+        <w:spacing w:before="160" w:after="40"/>
+      </w:pPr>
+      <w:r>
+        <w:rPr>
+          <w:b/>
+          <w:i w:val="0"/>
+          <w:color w:val="1E3A8A"/>
+          <w:sz w:val="20"/>
+        </w:rPr>
+        <w:t>Operational Impact</w:t>
+      </w:r>
+    </w:p>
+    <w:p>
+      <w:pPr>
+        <w:spacing w:after="60"/>
+      </w:pPr>
+      <w:r>
+        <w:rPr>
+          <w:b w:val="0"/>
+          <w:i w:val="0"/>
+          <w:color w:val="1F2937"/>
+          <w:sz w:val="19"/>
+        </w:rPr>
+        <w:t>● Built an automated cyber range in Azure Gov IL2 for experimentation and training</w:t>
+      </w:r>
+    </w:p>
+    <w:p>
+      <w:pPr>
+        <w:spacing w:after="60"/>
+      </w:pPr>
+      <w:r>
+        <w:rPr>
+          <w:b w:val="0"/>
+          <w:i w:val="0"/>
+          <w:color w:val="1F2937"/>
+          <w:sz w:val="19"/>
+        </w:rPr>
+        <w:t>● Delivered leadership briefings on risk posture and modernization impacts to senior stakeholders</w:t>
+      </w:r>
+    </w:p>
+    <w:p>
+      <w:pPr>
+        <w:spacing w:before="160" w:after="40"/>
+      </w:pPr>
+      <w:r>
+        <w:rPr>
+          <w:b/>
+          <w:i w:val="0"/>
+          <w:color w:val="1E3A8A"/>
+          <w:sz w:val="20"/>
+        </w:rPr>
+        <w:t>Key Contributions</w:t>
+      </w:r>
+    </w:p>
+    <w:p>
+      <w:pPr>
+        <w:spacing w:after="60"/>
+      </w:pPr>
+      <w:r>
+        <w:rPr>
+          <w:b w:val="0"/>
+          <w:i w:val="0"/>
+          <w:color w:val="1F2937"/>
+          <w:sz w:val="19"/>
+        </w:rPr>
+        <w:t>● Improved resilience, compliance, and testing velocity for cyber defense capabilities supporting mission operations</w:t>
+      </w:r>
+    </w:p>
+    <w:p>
+      <w:pPr>
+        <w:spacing w:before="120" w:after="0"/>
+        <w:pBdr>
+          <w:bottom w:val="single" w:sz="4" w:space="1" w:color="1E3A8A"/>
+        </w:pBdr>
+      </w:pPr>
+    </w:p>
+    <w:p>
+      <w:r>
+        <w:rPr>
+          <w:b/>
+          <w:i w:val="0"/>
+          <w:color w:val="1E3A8A"/>
+          <w:sz w:val="24"/>
+        </w:rPr>
+        <w:t>Network Operations SME – Senior</w:t>
+      </w:r>
+      <w:r>
+        <w:rPr>
+          <w:b w:val="0"/>
+          <w:i w:val="0"/>
+          <w:sz w:val="20"/>
+        </w:rPr>
+        <w:tab/>
+        <w:t>CACI / L3 NSS – USAF Southwest Asia AOR | Shaw AFB, SC</w:t>
+      </w:r>
+    </w:p>
+    <w:p>
+      <w:pPr>
+        <w:spacing w:after="80" w:before="0"/>
+        <w:jc w:val="right"/>
+      </w:pPr>
+      <w:r>
+        <w:rPr>
+          <w:b w:val="0"/>
+          <w:i w:val="0"/>
+          <w:color w:val="1F2937"/>
+          <w:sz w:val="19"/>
+        </w:rPr>
+        <w:t>2011 – 2017</w:t>
       </w:r>
     </w:p>
     <w:p>
       <w:r>
-        <w:t>Lead Azure architecture and engineering for the U.S. Air Force Cloud One Architecture and Common Shared Services (ACSS) multi-cloud environment spanning Azure, AWS, Google, and Oracle.</w:t>
+        <w:rPr>
+          <w:b w:val="0"/>
+          <w:i w:val="0"/>
+          <w:sz w:val="19"/>
+        </w:rPr>
+        <w:t>Led Tier 2/3 network operations and engineering for USAF infrastructure serving multiple bases in Southwest Asia.</w:t>
       </w:r>
     </w:p>
-    <w:p/>
     <w:p>
       <w:pPr>
-        <w:pStyle w:val="Heading3"/>
+        <w:spacing w:before="160" w:after="40"/>
       </w:pPr>
       <w:r>
-        <w:t>Responsibilities</w:t>
+        <w:rPr>
+          <w:b/>
+          <w:i w:val="0"/>
+          <w:color w:val="1E3A8A"/>
+          <w:sz w:val="20"/>
+        </w:rPr>
+        <w:t>Enterprise Network Architecture &amp; Engineering</w:t>
+      </w:r>
+    </w:p>
+    <w:p>
+      <w:pPr>
+        <w:spacing w:after="60"/>
+      </w:pPr>
+      <w:r>
+        <w:rPr>
+          <w:b w:val="0"/>
+          <w:i w:val="0"/>
+          <w:color w:val="1F2937"/>
+          <w:sz w:val="19"/>
+        </w:rPr>
+        <w:t>● Designed and maintained BGP/OSPF/EIGRP/MPLS topologies across distributed USAF installations</w:t>
+      </w:r>
+    </w:p>
+    <w:p>
+      <w:pPr>
+        <w:spacing w:after="60"/>
+      </w:pPr>
+      <w:r>
+        <w:rPr>
+          <w:b w:val="0"/>
+          <w:i w:val="0"/>
+          <w:color w:val="1F2937"/>
+          <w:sz w:val="19"/>
+        </w:rPr>
+        <w:t>● Managed ACS, AD integrations, and enterprise firewall clusters</w:t>
+      </w:r>
+    </w:p>
+    <w:p>
+      <w:pPr>
+        <w:spacing w:before="160" w:after="40"/>
+      </w:pPr>
+      <w:r>
+        <w:rPr>
+          <w:b/>
+          <w:i w:val="0"/>
+          <w:color w:val="1E3A8A"/>
+          <w:sz w:val="20"/>
+        </w:rPr>
+        <w:t>Security &amp; Infrastructure Operations</w:t>
+      </w:r>
+    </w:p>
+    <w:p>
+      <w:pPr>
+        <w:spacing w:after="60"/>
+      </w:pPr>
+      <w:r>
+        <w:rPr>
+          <w:b w:val="0"/>
+          <w:i w:val="0"/>
+          <w:color w:val="1F2937"/>
+          <w:sz w:val="19"/>
+        </w:rPr>
+        <w:t>● Implemented cybersecurity hardening on network and Windows infrastructure</w:t>
+      </w:r>
+    </w:p>
+    <w:p>
+      <w:pPr>
+        <w:spacing w:after="60"/>
+      </w:pPr>
+      <w:r>
+        <w:rPr>
+          <w:b w:val="0"/>
+          <w:i w:val="0"/>
+          <w:color w:val="1F2937"/>
+          <w:sz w:val="19"/>
+        </w:rPr>
+        <w:t>● Supported WAN, VoIP, routing, switching, and data center platforms</w:t>
+      </w:r>
+    </w:p>
+    <w:p>
+      <w:pPr>
+        <w:spacing w:before="160" w:after="40"/>
+      </w:pPr>
+      <w:r>
+        <w:rPr>
+          <w:b/>
+          <w:i w:val="0"/>
+          <w:color w:val="1E3A8A"/>
+          <w:sz w:val="20"/>
+        </w:rPr>
+        <w:t>Key Contributions</w:t>
+      </w:r>
+    </w:p>
+    <w:p>
+      <w:pPr>
+        <w:spacing w:after="60"/>
+      </w:pPr>
+      <w:r>
+        <w:rPr>
+          <w:b w:val="0"/>
+          <w:i w:val="0"/>
+          <w:color w:val="1F2937"/>
+          <w:sz w:val="19"/>
+        </w:rPr>
+        <w:t>● Maintained mission-critical availability and improved security posture across large-scale distributed network operations</w:t>
+      </w:r>
+    </w:p>
+    <w:p>
+      <w:pPr>
+        <w:spacing w:before="120" w:after="0"/>
+        <w:pBdr>
+          <w:bottom w:val="single" w:sz="4" w:space="1" w:color="1E3A8A"/>
+        </w:pBdr>
+      </w:pPr>
+    </w:p>
+    <w:p>
+      <w:r>
+        <w:rPr>
+          <w:b/>
+          <w:i w:val="0"/>
+          <w:color w:val="1E3A8A"/>
+          <w:sz w:val="24"/>
+        </w:rPr>
+        <w:t>Network Operations Technician</w:t>
+      </w:r>
+      <w:r>
+        <w:rPr>
+          <w:b w:val="0"/>
+          <w:i w:val="0"/>
+          <w:sz w:val="20"/>
+        </w:rPr>
+        <w:tab/>
+        <w:t>L3 NSS – USAF Enterprise Network | Shaw AFB, SC</w:t>
+      </w:r>
+    </w:p>
+    <w:p>
+      <w:pPr>
+        <w:spacing w:after="80" w:before="0"/>
+        <w:jc w:val="right"/>
+      </w:pPr>
+      <w:r>
+        <w:rPr>
+          <w:b w:val="0"/>
+          <w:i w:val="0"/>
+          <w:color w:val="1F2937"/>
+          <w:sz w:val="19"/>
+        </w:rPr>
+        <w:t>2010 – 2011</w:t>
       </w:r>
     </w:p>
     <w:p>
       <w:r>
-        <w:t>Design scalable, resilient, and secure Azure architectures and reference patterns for the Cloud One multi-cloud environment.</w:t>
+        <w:rPr>
+          <w:b w:val="0"/>
+          <w:i w:val="0"/>
+          <w:sz w:val="19"/>
+        </w:rPr>
+        <w:t>Delivered Tier 0–2 operational support for core network, identity, and security services in USAF enterprise environments.</w:t>
+      </w:r>
+    </w:p>
+    <w:p>
+      <w:pPr>
+        <w:spacing w:before="160" w:after="40"/>
+      </w:pPr>
+      <w:r>
+        <w:rPr>
+          <w:b/>
+          <w:i w:val="0"/>
+          <w:color w:val="1E3A8A"/>
+          <w:sz w:val="20"/>
+        </w:rPr>
+        <w:t>Operational Support</w:t>
+      </w:r>
+    </w:p>
+    <w:p>
+      <w:pPr>
+        <w:spacing w:after="60"/>
+      </w:pPr>
+      <w:r>
+        <w:rPr>
+          <w:b w:val="0"/>
+          <w:i w:val="0"/>
+          <w:color w:val="1F2937"/>
+          <w:sz w:val="19"/>
+        </w:rPr>
+        <w:t>● Troubleshot WAN, DNS, routing, and firewall incidents</w:t>
+      </w:r>
+    </w:p>
+    <w:p>
+      <w:pPr>
+        <w:spacing w:after="60"/>
+      </w:pPr>
+      <w:r>
+        <w:rPr>
+          <w:b w:val="0"/>
+          <w:i w:val="0"/>
+          <w:color w:val="1F2937"/>
+          <w:sz w:val="19"/>
+        </w:rPr>
+        <w:t>● Applied DoD-approved router/switch configurations</w:t>
+      </w:r>
+    </w:p>
+    <w:p>
+      <w:pPr>
+        <w:spacing w:after="60"/>
+      </w:pPr>
+      <w:r>
+        <w:rPr>
+          <w:b w:val="0"/>
+          <w:i w:val="0"/>
+          <w:color w:val="1F2937"/>
+          <w:sz w:val="19"/>
+        </w:rPr>
+        <w:t>● Supported AD/GPO operations and Windows hardening standards</w:t>
+      </w:r>
+    </w:p>
+    <w:p>
+      <w:pPr>
+        <w:spacing w:before="160" w:after="40"/>
+      </w:pPr>
+      <w:r>
+        <w:rPr>
+          <w:b/>
+          <w:i w:val="0"/>
+          <w:color w:val="1E3A8A"/>
+          <w:sz w:val="20"/>
+        </w:rPr>
+        <w:t>Key Contributions</w:t>
+      </w:r>
+    </w:p>
+    <w:p>
+      <w:pPr>
+        <w:spacing w:after="60"/>
+      </w:pPr>
+      <w:r>
+        <w:rPr>
+          <w:b w:val="0"/>
+          <w:i w:val="0"/>
+          <w:color w:val="1F2937"/>
+          <w:sz w:val="19"/>
+        </w:rPr>
+        <w:t>● Improved service reliability and baseline security for critical network operations supporting NIPR and SIPR environments</w:t>
+      </w:r>
+    </w:p>
+    <w:p>
+      <w:pPr>
+        <w:spacing w:before="120" w:after="0"/>
+        <w:pBdr>
+          <w:bottom w:val="single" w:sz="4" w:space="1" w:color="1E3A8A"/>
+        </w:pBdr>
+      </w:pPr>
+    </w:p>
+    <w:p>
+      <w:r>
+        <w:rPr>
+          <w:b/>
+          <w:i w:val="0"/>
+          <w:color w:val="1E3A8A"/>
+          <w:sz w:val="24"/>
+        </w:rPr>
+        <w:t>0651 Data Network Specialist</w:t>
+      </w:r>
+      <w:r>
+        <w:rPr>
+          <w:b w:val="0"/>
+          <w:i w:val="0"/>
+          <w:sz w:val="20"/>
+        </w:rPr>
+        <w:tab/>
+        <w:t>United States Marine Corps, 3rd Marine Division | Kaneohe Bay, HI</w:t>
+      </w:r>
+    </w:p>
+    <w:p>
+      <w:pPr>
+        <w:spacing w:after="80" w:before="0"/>
+        <w:jc w:val="right"/>
+      </w:pPr>
+      <w:r>
+        <w:rPr>
+          <w:b w:val="0"/>
+          <w:i w:val="0"/>
+          <w:color w:val="1F2937"/>
+          <w:sz w:val="19"/>
+        </w:rPr>
+        <w:t>2000 – 2004</w:t>
       </w:r>
     </w:p>
     <w:p>
       <w:r>
-        <w:t>Manage and mentor a team of cloud engineers delivering secure, cloud-native shared services across IL4/IL5/IL6 workloads.</w:t>
+        <w:rPr>
+          <w:b w:val="0"/>
+          <w:i w:val="0"/>
+          <w:sz w:val="19"/>
+        </w:rPr>
+        <w:t>Provided network and systems support for mission-critical military communications across classified and unclassified environments.</w:t>
       </w:r>
     </w:p>
     <w:p>
+      <w:pPr>
+        <w:spacing w:before="160" w:after="40"/>
+      </w:pPr>
       <w:r>
-        <w:t>Drive adoption of DevSecOps practices, infrastructure as code, and automation using Terraform, Ansible, Jenkins, and Kubernetes.</w:t>
+        <w:rPr>
+          <w:b/>
+          <w:i w:val="0"/>
+          <w:color w:val="1E3A8A"/>
+          <w:sz w:val="20"/>
+        </w:rPr>
+        <w:t>Operational Support</w:t>
       </w:r>
     </w:p>
     <w:p>
-      <w:r>
-        <w:t>Architect secure cloud solutions implementing zero-trust principles and defense-in-depth across IL4/IL5/IL6 boundaries.</w:t>
-      </w:r>
-    </w:p>
-    <w:p/>
-    <w:p>
       <w:pPr>
-        <w:pStyle w:val="Heading3"/>
+        <w:spacing w:after="60"/>
       </w:pPr>
       <w:r>
-        <w:t>Impact</w:t>
+        <w:rPr>
+          <w:b w:val="0"/>
+          <w:i w:val="0"/>
+          <w:color w:val="1F2937"/>
+          <w:sz w:val="19"/>
+        </w:rPr>
+        <w:t>● Delivered remote and on-site support for Windows and UNIX users</w:t>
       </w:r>
     </w:p>
     <w:p>
-      <w:r>
-        <w:t>Advancing standardized, secure Azure reference architectures and DevSecOps automation across the Cloud One environment to strengthen USAF system resiliency, security, and cost effectiveness.</w:t>
-      </w:r>
-    </w:p>
-    <w:p/>
-    <w:p>
       <w:pPr>
-        <w:pStyle w:val="Heading2"/>
+        <w:spacing w:after="60"/>
       </w:pPr>
       <w:r>
-        <w:t>Senior Cloud Cyber Security Engineer - Lead</w:t>
-        <w:br/>
-        <w:t>SAIC – Cloud One Program | Remote</w:t>
+        <w:rPr>
+          <w:b w:val="0"/>
+          <w:i w:val="0"/>
+          <w:color w:val="1F2937"/>
+          <w:sz w:val="19"/>
+        </w:rPr>
+        <w:t>● Maintained SIPR/NIPR communications and user services</w:t>
       </w:r>
     </w:p>
     <w:p>
+      <w:pPr>
+        <w:spacing w:after="60"/>
+      </w:pPr>
       <w:r>
-        <w:t>2023-01 to 2026-02</w:t>
+        <w:rPr>
+          <w:b w:val="0"/>
+          <w:i w:val="0"/>
+          <w:color w:val="1F2937"/>
+          <w:sz w:val="19"/>
+        </w:rPr>
+        <w:t>● Managed accounts, permissions, and workstation support</w:t>
       </w:r>
     </w:p>
     <w:p>
-      <w:r>
-        <w:t>Serve as senior cybersecurity engineer supporting the Cloud One Common Computing Environment—a globally distributed hybrid cloud hosting mission-critical USAF and Army workloads.</w:t>
-      </w:r>
-    </w:p>
-    <w:p/>
-    <w:p>
       <w:pPr>
-        <w:pStyle w:val="Heading3"/>
+        <w:spacing w:before="160" w:after="40"/>
       </w:pPr>
       <w:r>
-        <w:t>Responsibilities</w:t>
+        <w:rPr>
+          <w:b/>
+          <w:i w:val="0"/>
+          <w:color w:val="1E3A8A"/>
+          <w:sz w:val="20"/>
+        </w:rPr>
+        <w:t>Key Contributions</w:t>
       </w:r>
     </w:p>
     <w:p>
+      <w:pPr>
+        <w:spacing w:after="60"/>
+      </w:pPr>
       <w:r>
-        <w:t>Lead vulnerability triage and remediation planning across virtualized, containerized, and cloud-native systems.</w:t>
+        <w:rPr>
+          <w:b w:val="0"/>
+          <w:i w:val="0"/>
+          <w:color w:val="1F2937"/>
+          <w:sz w:val="19"/>
+        </w:rPr>
+        <w:t>● Contributed to stable communications posture and operational readiness in high-demand military environments</w:t>
       </w:r>
     </w:p>
     <w:p>
-      <w:r>
-        <w:t>Produce SAP, SAR, and POA&amp;M artifacts supporting RMF and authorization workflows.</w:t>
-      </w:r>
-    </w:p>
-    <w:p>
-      <w:r>
-        <w:t>Implement and validate controls aligned to NIST 800-53, SRGs, STIGs, and DoD 8500/8510 guidance.</w:t>
-      </w:r>
-    </w:p>
-    <w:p>
-      <w:r>
-        <w:t>Integrate security checks into CI/CD pipelines and advise system owners through RMF lifecycle sustainment.</w:t>
-      </w:r>
-    </w:p>
-    <w:p/>
-    <w:p>
       <w:pPr>
-        <w:pStyle w:val="Heading3"/>
+        <w:spacing w:before="280" w:after="80"/>
       </w:pPr>
       <w:r>
-        <w:t>Impact</w:t>
-      </w:r>
-    </w:p>
-    <w:p>
-      <w:r>
-        <w:t>Established repeatable security inheritance patterns and improved compliance velocity while sustaining operational security across IL4/IL5/IL6 systems.</w:t>
-      </w:r>
-    </w:p>
-    <w:p/>
-    <w:p>
-      <w:pPr>
-        <w:pStyle w:val="Heading2"/>
-      </w:pPr>
-      <w:r>
-        <w:t>Cloud Architect</w:t>
-        <w:br/>
-        <w:t>SAIC – USCENTCOM J6 | MacDill AFB, Tampa, FL</w:t>
-      </w:r>
-    </w:p>
-    <w:p>
-      <w:r>
-        <w:t>2022-01 to 2023-12</w:t>
-      </w:r>
-    </w:p>
-    <w:p>
-      <w:r>
-        <w:t>Led architecture for CENTCOM cloud modernization and initial Azure Government IL5/IL6 adoption, balancing mission delivery with strict security and compliance requirements.</w:t>
-      </w:r>
-    </w:p>
-    <w:p/>
-    <w:p>
-      <w:pPr>
-        <w:pStyle w:val="Heading3"/>
-      </w:pPr>
-      <w:r>
-        <w:t>Responsibilities</w:t>
-      </w:r>
-    </w:p>
-    <w:p>
-      <w:r>
-        <w:t>Designed secure enterprise cloud landing zones aligned to SRG, RMF, and SCCA requirements.</w:t>
-      </w:r>
-    </w:p>
-    <w:p>
-      <w:r>
-        <w:t>Architected DevSecOps workflows and standardized infrastructure templates.</w:t>
-      </w:r>
-    </w:p>
-    <w:p>
-      <w:r>
-        <w:t>Designed lakehouse analytics patterns with Azure Synapse and medallion architecture.</w:t>
-      </w:r>
-    </w:p>
-    <w:p>
-      <w:r>
-        <w:t>Produced technical trade studies and migration recommendations for mission owners.</w:t>
-      </w:r>
-    </w:p>
-    <w:p/>
-    <w:p>
-      <w:pPr>
-        <w:pStyle w:val="Heading3"/>
-      </w:pPr>
-      <w:r>
-        <w:t>Impact</w:t>
-      </w:r>
-    </w:p>
-    <w:p>
-      <w:r>
-        <w:t>Enabled CENTCOM's first scalable cloud architecture baseline with consistent governance, faster delivery, and improved mission analytics enablement.</w:t>
-      </w:r>
-    </w:p>
-    <w:p/>
-    <w:p>
-      <w:pPr>
-        <w:pStyle w:val="Heading2"/>
-      </w:pPr>
-      <w:r>
-        <w:t>Innovations Engineer, Cloud and Modernization</w:t>
-        <w:br/>
-        <w:t>SAIC – USCENTCOM J6 Technology Innovation Branch | MacDill AFB, Tampa, FL</w:t>
-      </w:r>
-    </w:p>
-    <w:p>
-      <w:r>
-        <w:t>2020-01 to 2022-12</w:t>
-      </w:r>
-    </w:p>
-    <w:p>
-      <w:r>
-        <w:t>Advised CENTCOM J6 modernization initiatives by evaluating emerging technologies and mapping them to secure, interoperable adoption paths.</w:t>
-      </w:r>
-    </w:p>
-    <w:p/>
-    <w:p>
-      <w:pPr>
-        <w:pStyle w:val="Heading3"/>
-      </w:pPr>
-      <w:r>
-        <w:t>Responsibilities</w:t>
-      </w:r>
-    </w:p>
-    <w:p>
-      <w:r>
-        <w:t>Conducted technical evaluations of cyber, cloud, and network capabilities.</w:t>
-      </w:r>
-    </w:p>
-    <w:p>
-      <w:r>
-        <w:t>Authored briefs and analysis for senior leadership and mission planners.</w:t>
-      </w:r>
-    </w:p>
-    <w:p>
-      <w:r>
-        <w:t>Supported IL5/IL6 migration efforts and ATO-related engineering activities.</w:t>
-      </w:r>
-    </w:p>
-    <w:p>
-      <w:r>
-        <w:t>Coordinated architecture alignment across matrixed engineering teams.</w:t>
-      </w:r>
-    </w:p>
-    <w:p/>
-    <w:p>
-      <w:pPr>
-        <w:pStyle w:val="Heading3"/>
-      </w:pPr>
-      <w:r>
-        <w:t>Impact</w:t>
-      </w:r>
-    </w:p>
-    <w:p>
-      <w:r>
-        <w:t>Helped define a practical modernization roadmap that advanced cloud adoption while meeting security, interoperability, and mission constraints.</w:t>
-      </w:r>
-    </w:p>
-    <w:p/>
-    <w:p>
-      <w:pPr>
-        <w:pStyle w:val="Heading2"/>
-      </w:pPr>
-      <w:r>
-        <w:t>Senior Cyber Infrastructure Analyst</w:t>
-        <w:br/>
-        <w:t>SAIC – USCENTCOM | MacDill AFB, Tampa, FL</w:t>
-      </w:r>
-    </w:p>
-    <w:p>
-      <w:r>
-        <w:t>2017-01 to 2020-12</w:t>
-      </w:r>
-    </w:p>
-    <w:p>
-      <w:r>
-        <w:t>Designed and sustained cybersecurity boundary infrastructure for USCENTCOM headquarters and operational theater networks.</w:t>
-      </w:r>
-    </w:p>
-    <w:p/>
-    <w:p>
-      <w:pPr>
-        <w:pStyle w:val="Heading3"/>
-      </w:pPr>
-      <w:r>
-        <w:t>Responsibilities</w:t>
-      </w:r>
-    </w:p>
-    <w:p>
-      <w:r>
-        <w:t>Engineered and maintained firewalls, IDS/IPS, and filtering infrastructure.</w:t>
-      </w:r>
-    </w:p>
-    <w:p>
-      <w:r>
-        <w:t>Led planning for CND tool migration to JRSS and modernization tracks.</w:t>
-      </w:r>
-    </w:p>
-    <w:p>
-      <w:r>
-        <w:t>Built an automated cyber range in Azure Gov IL2 for experimentation.</w:t>
-      </w:r>
-    </w:p>
-    <w:p>
-      <w:r>
-        <w:t>Delivered leadership briefings on risk posture and modernization impacts.</w:t>
-      </w:r>
-    </w:p>
-    <w:p/>
-    <w:p>
-      <w:pPr>
-        <w:pStyle w:val="Heading3"/>
-      </w:pPr>
-      <w:r>
-        <w:t>Impact</w:t>
-      </w:r>
-    </w:p>
-    <w:p>
-      <w:r>
-        <w:t>Improved resilience, compliance, and testing velocity for cyber defense capabilities supporting mission operations.</w:t>
-      </w:r>
-    </w:p>
-    <w:p/>
-    <w:p>
-      <w:pPr>
-        <w:pStyle w:val="Heading2"/>
-      </w:pPr>
-      <w:r>
-        <w:t>Network Operations SME, Senior</w:t>
-        <w:br/>
-        <w:t>CACI / L3 NSS – USAF Southwest Asia AOR | Shaw AFB, SC</w:t>
-      </w:r>
-    </w:p>
-    <w:p>
-      <w:r>
-        <w:t>2011-01 to 2017-12</w:t>
-      </w:r>
-    </w:p>
-    <w:p>
-      <w:r>
-        <w:t>Led Tier 2/3 network operations and engineering for USAF infrastructure serving multiple bases in Southwest Asia.</w:t>
-      </w:r>
-    </w:p>
-    <w:p/>
-    <w:p>
-      <w:pPr>
-        <w:pStyle w:val="Heading3"/>
-      </w:pPr>
-      <w:r>
-        <w:t>Responsibilities</w:t>
-      </w:r>
-    </w:p>
-    <w:p>
-      <w:r>
-        <w:t>Supported WAN, VoIP, routing, switching, and data center platforms.</w:t>
-      </w:r>
-    </w:p>
-    <w:p>
-      <w:r>
-        <w:t>Designed and maintained BGP/OSPF/EIGRP/MPLS topologies.</w:t>
-      </w:r>
-    </w:p>
-    <w:p>
-      <w:r>
-        <w:t>Managed ACS, AD integrations, and enterprise firewall clusters.</w:t>
-      </w:r>
-    </w:p>
-    <w:p>
-      <w:r>
-        <w:t>Implemented cybersecurity hardening on network and Windows infrastructure.</w:t>
-      </w:r>
-    </w:p>
-    <w:p/>
-    <w:p>
-      <w:pPr>
-        <w:pStyle w:val="Heading3"/>
-      </w:pPr>
-      <w:r>
-        <w:t>Impact</w:t>
-      </w:r>
-    </w:p>
-    <w:p>
-      <w:r>
-        <w:t>Maintained mission-critical availability and improved security posture across large-scale distributed network operations.</w:t>
-      </w:r>
-    </w:p>
-    <w:p/>
-    <w:p>
-      <w:pPr>
-        <w:pStyle w:val="Heading2"/>
-      </w:pPr>
-      <w:r>
-        <w:t>Network Operations Technician</w:t>
-        <w:br/>
-        <w:t>L3 NSS – USAF Enterprise Network | Shaw AFB, SC</w:t>
-      </w:r>
-    </w:p>
-    <w:p>
-      <w:r>
-        <w:t>2010-01 to 2011-12</w:t>
-      </w:r>
-    </w:p>
-    <w:p>
-      <w:r>
-        <w:t>Delivered Tier 0–2 operational support for core network, identity, and security services in USAF enterprise environments.</w:t>
-      </w:r>
-    </w:p>
-    <w:p/>
-    <w:p>
-      <w:pPr>
-        <w:pStyle w:val="Heading3"/>
-      </w:pPr>
-      <w:r>
-        <w:t>Responsibilities</w:t>
-      </w:r>
-    </w:p>
-    <w:p>
-      <w:r>
-        <w:t>Troubleshot WAN, DNS, routing, and firewall incidents.</w:t>
-      </w:r>
-    </w:p>
-    <w:p>
-      <w:r>
-        <w:t>Applied DoD-approved router/switch configurations.</w:t>
-      </w:r>
-    </w:p>
-    <w:p>
-      <w:r>
-        <w:t>Supported AD/GPO operations and Windows hardening standards.</w:t>
-      </w:r>
-    </w:p>
-    <w:p>
-      <w:r>
-        <w:t>Provided remote support to comm squadrons across installations.</w:t>
-      </w:r>
-    </w:p>
-    <w:p/>
-    <w:p>
-      <w:pPr>
-        <w:pStyle w:val="Heading3"/>
-      </w:pPr>
-      <w:r>
-        <w:t>Impact</w:t>
-      </w:r>
-    </w:p>
-    <w:p>
-      <w:r>
-        <w:t>Improved service reliability and baseline security for critical network operations supporting NIPR and SIPR environments.</w:t>
-      </w:r>
-    </w:p>
-    <w:p/>
-    <w:p>
-      <w:pPr>
-        <w:pStyle w:val="Heading2"/>
-      </w:pPr>
-      <w:r>
-        <w:t>0651 Data Network Specialist</w:t>
-        <w:br/>
-        <w:t>United States Marine Corps, 3rd Marine Division | Kaneohe Bay, HI</w:t>
-      </w:r>
-    </w:p>
-    <w:p>
-      <w:r>
-        <w:t>2000-01 to 2004-12</w:t>
-      </w:r>
-    </w:p>
-    <w:p>
-      <w:r>
-        <w:t>Provided network and systems support for mission-critical military communications across classified and unclassified environments.</w:t>
-      </w:r>
-    </w:p>
-    <w:p/>
-    <w:p>
-      <w:pPr>
-        <w:pStyle w:val="Heading3"/>
-      </w:pPr>
-      <w:r>
-        <w:t>Responsibilities</w:t>
-      </w:r>
-    </w:p>
-    <w:p>
-      <w:r>
-        <w:t>Delivered remote and on-site support for Windows and UNIX users.</w:t>
-      </w:r>
-    </w:p>
-    <w:p>
-      <w:r>
-        <w:t>Maintained SIPR/NIPR communications and user services.</w:t>
-      </w:r>
-    </w:p>
-    <w:p>
-      <w:r>
-        <w:t>Managed accounts, permissions, and workstation support.</w:t>
-      </w:r>
-    </w:p>
-    <w:p>
-      <w:r>
-        <w:t>Supported field exercises and deployments with communications operations.</w:t>
-      </w:r>
-    </w:p>
-    <w:p/>
-    <w:p>
-      <w:pPr>
-        <w:pStyle w:val="Heading3"/>
-      </w:pPr>
-      <w:r>
-        <w:t>Impact</w:t>
-      </w:r>
-    </w:p>
-    <w:p>
-      <w:r>
-        <w:t>Contributed to stable communications posture and operational readiness in high-demand military environments.</w:t>
-      </w:r>
-    </w:p>
-    <w:p/>
-    <w:p>
-      <w:pPr>
-        <w:pStyle w:val="Heading1"/>
-      </w:pPr>
-      <w:r>
+        <w:rPr>
+          <w:b/>
+          <w:i w:val="0"/>
+          <w:color w:val="1E3A8A"/>
+          <w:sz w:val="32"/>
+        </w:rPr>
         <w:t>EDUCATION</w:t>
       </w:r>
     </w:p>
     <w:p>
       <w:r>
-        <w:t>Bachelor of Science in Computer Engineering &amp; Technology from Middle Tennessee State University (MTSU), Murfreesboro, TN, with a minor in Computer Science. Coursework covered embedded systems programming, digital logic design, and software development — the education that preceded cloud architecture and cybersecurity work across DoD mission environments.</w:t>
+        <w:rPr>
+          <w:b/>
+          <w:i w:val="0"/>
+          <w:color w:val="1E3A8A"/>
+          <w:sz w:val="20"/>
+        </w:rPr>
+        <w:t>Bachelor of Science – Computer Engineering &amp; Technology</w:t>
+      </w:r>
+      <w:r>
+        <w:rPr>
+          <w:b w:val="0"/>
+          <w:i w:val="0"/>
+          <w:sz w:val="19"/>
+        </w:rPr>
+        <w:br/>
+        <w:t>Middle Tennessee State University | Minor: Computer Science</w:t>
       </w:r>
     </w:p>
-    <w:p/>
     <w:p>
       <w:pPr>
-        <w:pStyle w:val="Heading1"/>
+        <w:spacing w:before="280" w:after="80"/>
       </w:pPr>
       <w:r>
+        <w:rPr>
+          <w:b/>
+          <w:i w:val="0"/>
+          <w:color w:val="1E3A8A"/>
+          <w:sz w:val="32"/>
+        </w:rPr>
         <w:t>CERTIFICATIONS</w:t>
       </w:r>
     </w:p>
     <w:p>
       <w:r>
-        <w:t>Microsoft Certified: Azure Solutions Architect Expert</w:t>
+        <w:rPr>
+          <w:b/>
+          <w:i w:val="0"/>
+          <w:color w:val="1E3A8A"/>
+          <w:sz w:val="19"/>
+        </w:rPr>
+        <w:t>Microsoft Certified:</w:t>
+      </w:r>
+      <w:r>
+        <w:rPr>
+          <w:b w:val="0"/>
+          <w:i w:val="0"/>
+          <w:sz w:val="19"/>
+        </w:rPr>
+        <w:br/>
+        <w:t>Azure Solutions Architect Expert</w:t>
+        <w:br/>
+        <w:t>Azure AI Engineer Associate</w:t>
       </w:r>
     </w:p>
     <w:p>
       <w:r>
-        <w:t>Microsoft Certified: Azure AI Engineer Associate</w:t>
+        <w:rPr>
+          <w:b/>
+          <w:i w:val="0"/>
+          <w:color w:val="1E3A8A"/>
+          <w:sz w:val="19"/>
+        </w:rPr>
+        <w:t>ISC²:</w:t>
+      </w:r>
+      <w:r>
+        <w:rPr>
+          <w:b w:val="0"/>
+          <w:i w:val="0"/>
+          <w:sz w:val="19"/>
+        </w:rPr>
+        <w:br/>
+        <w:t>Certified Cloud Security Professional (CCSP) – In Progress</w:t>
       </w:r>
     </w:p>
     <w:p>
       <w:r>
+        <w:rPr>
+          <w:b/>
+          <w:i w:val="0"/>
+          <w:color w:val="1E3A8A"/>
+          <w:sz w:val="19"/>
+        </w:rPr>
+        <w:t>Amazon:</w:t>
+      </w:r>
+      <w:r>
+        <w:rPr>
+          <w:b w:val="0"/>
+          <w:i w:val="0"/>
+          <w:sz w:val="19"/>
+        </w:rPr>
+        <w:br/>
         <w:t>AWS Certified Solutions Architect – Associate</w:t>
       </w:r>
     </w:p>
     <w:p>
       <w:r>
+        <w:rPr>
+          <w:b/>
+          <w:i w:val="0"/>
+          <w:color w:val="1E3A8A"/>
+          <w:sz w:val="19"/>
+        </w:rPr>
+        <w:t>Security:</w:t>
+      </w:r>
+      <w:r>
+        <w:rPr>
+          <w:b w:val="0"/>
+          <w:i w:val="0"/>
+          <w:sz w:val="19"/>
+        </w:rPr>
+        <w:br/>
         <w:t>CompTIA Security+</w:t>
       </w:r>
     </w:p>
     <w:p>
       <w:r>
+        <w:rPr>
+          <w:b/>
+          <w:i w:val="0"/>
+          <w:color w:val="1E3A8A"/>
+          <w:sz w:val="19"/>
+        </w:rPr>
+        <w:t>Networking:</w:t>
+      </w:r>
+      <w:r>
+        <w:rPr>
+          <w:b w:val="0"/>
+          <w:i w:val="0"/>
+          <w:sz w:val="19"/>
+        </w:rPr>
+        <w:br/>
         <w:t>Cisco CCNP / CCNA Security / CCNA Data Center</w:t>
       </w:r>
     </w:p>
     <w:p>
       <w:r>
+        <w:rPr>
+          <w:b/>
+          <w:i w:val="0"/>
+          <w:color w:val="1E3A8A"/>
+          <w:sz w:val="19"/>
+        </w:rPr>
+        <w:t>ITIL:</w:t>
+      </w:r>
+      <w:r>
+        <w:rPr>
+          <w:b w:val="0"/>
+          <w:i w:val="0"/>
+          <w:sz w:val="19"/>
+        </w:rPr>
+        <w:br/>
         <w:t>ITIL v3 Foundation</w:t>
       </w:r>
     </w:p>
     <w:sectPr>
       <w:pgSz w:w="12240" w:h="15840"/>
-      <w:pgMar w:top="1440" w:right="1800" w:bottom="1440" w:left="1800" w:header="720" w:footer="720" w:gutter="0"/>
+      <w:pgMar w:top="720" w:right="1080" w:bottom="576" w:left="1080" w:header="720" w:footer="720" w:gutter="0"/>
       <w:cols w:space="720"/>
       <w:docGrid w:linePitch="360"/>
     </w:sectPr>

</xml_diff>